<commit_message>
Add editable mini-budget with scope-based percentage allocation
</commit_message>
<xml_diff>
--- a/src/templates/prepped/change-order.docx
+++ b/src/templates/prepped/change-order.docx
@@ -1462,10 +1462,11 @@
             </w:pPr>
             <w:r>
               <w:rPr>
-                <w:sz w:val="28"/>
-                <w:szCs w:val="28"/>
-              </w:rPr>
-              <w:t xml:space="preserve"/>
+                <w:sz w:val="24"/>
+                <w:szCs w:val="24"/>
+                <w:color w:val="CCCCCC"/>
+              </w:rPr>
+              <w:t xml:space="preserve">{{sign|1|*| |client_sig}}</w:t>
             </w:r>
           </w:p>
         </w:tc>
@@ -1613,7 +1614,7 @@
                 <w:sz w:val="28"/>
                 <w:szCs w:val="28"/>
               </w:rPr>
-              <w:t xml:space="preserve"/>
+              <w:t xml:space="preserve">{{client_name}}</w:t>
             </w:r>
           </w:p>
         </w:tc>
@@ -1756,10 +1757,11 @@
             </w:pPr>
             <w:r>
               <w:rPr>
-                <w:sz w:val="28"/>
-                <w:szCs w:val="28"/>
-              </w:rPr>
-              <w:t xml:space="preserve"/>
+                <w:sz w:val="24"/>
+                <w:szCs w:val="24"/>
+                <w:color w:val="CCCCCC"/>
+              </w:rPr>
+              <w:t xml:space="preserve">{{date|1|*| |client_date}}</w:t>
             </w:r>
           </w:p>
         </w:tc>

</xml_diff>

<commit_message>
Fix ghosted merge tags on signed documents - force white text color at send time
</commit_message>
<xml_diff>
--- a/src/templates/prepped/change-order.docx
+++ b/src/templates/prepped/change-order.docx
@@ -1464,7 +1464,7 @@
               <w:rPr>
                 <w:sz w:val="24"/>
                 <w:szCs w:val="24"/>
-                <w:color w:val="CCCCCC"/>
+                <w:color w:val="FFFFFF"/>
               </w:rPr>
               <w:t xml:space="preserve">{{sign|1|*| |client_sig}}</w:t>
             </w:r>
@@ -1759,7 +1759,7 @@
               <w:rPr>
                 <w:sz w:val="24"/>
                 <w:szCs w:val="24"/>
-                <w:color w:val="CCCCCC"/>
+                <w:color w:val="FFFFFF"/>
               </w:rPr>
               <w:t xml:space="preserve">{{date|1|*| |client_date}}</w:t>
             </w:r>

</xml_diff>